<commit_message>
some changes on cv
</commit_message>
<xml_diff>
--- a/Cv.docx
+++ b/Cv.docx
@@ -182,7 +182,7 @@
           </mc:Choice>
           <mc:Fallback>
             <w:pict>
-              <v:shape id="_x0000_s1026" o:spid="_x0000_s1026" o:spt="202" type="#_x0000_t202" style="position:absolute;left:0pt;margin-left:223.15pt;margin-top:334.35pt;height:65.25pt;width:194.2pt;z-index:251666432;mso-width-relative:page;mso-height-relative:page;" fillcolor="#FFFFFF [3201]" filled="t" stroked="t" coordsize="21600,21600" o:gfxdata="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">
+              <v:shape id="_x0000_s1026" o:spid="_x0000_s1026" o:spt="202" type="#_x0000_t202" style="position:absolute;left:0pt;margin-left:223.15pt;margin-top:334.35pt;height:65.25pt;width:194.2pt;z-index:251666432;mso-width-relative:page;mso-height-relative:page;" fillcolor="#FFFFFF [3201]" filled="t" stroked="t" coordsize="21600,21600" o:gfxdata="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">
                 <v:fill on="t" focussize="0,0"/>
                 <v:stroke weight="0.5pt" color="#000000 [3204]" joinstyle="round"/>
                 <v:imagedata o:title=""/>
@@ -337,7 +337,7 @@
           </mc:Choice>
           <mc:Fallback>
             <w:pict>
-              <v:shape id="_x0000_s1026" o:spid="_x0000_s1026" o:spt="202" type="#_x0000_t202" style="position:absolute;left:0pt;margin-left:190.9pt;margin-top:422.55pt;height:258.65pt;width:296.15pt;z-index:251664384;mso-width-relative:page;mso-height-relative:page;" fillcolor="#FFFFFF [3201]" filled="t" stroked="t" coordsize="21600,21600" o:gfxdata="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">
+              <v:shape id="_x0000_s1026" o:spid="_x0000_s1026" o:spt="202" type="#_x0000_t202" style="position:absolute;left:0pt;margin-left:190.9pt;margin-top:422.55pt;height:258.65pt;width:296.15pt;z-index:251664384;mso-width-relative:page;mso-height-relative:page;" fillcolor="#FFFFFF [3201]" filled="t" stroked="t" coordsize="21600,21600" o:gfxdata="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">
                 <v:fill on="t" focussize="0,0"/>
                 <v:stroke weight="0.5pt" color="#000000 [3204]" joinstyle="round"/>
                 <v:imagedata o:title=""/>
@@ -1040,7 +1040,7 @@
           </mc:Choice>
           <mc:Fallback>
             <w:pict>
-              <v:shape id="_x0000_s1026" o:spid="_x0000_s1026" o:spt="202" type="#_x0000_t202" style="position:absolute;left:0pt;margin-left:-79.95pt;margin-top:411.3pt;height:193.35pt;width:247.55pt;z-index:251661312;mso-width-relative:page;mso-height-relative:page;" fillcolor="#FFFFFF [3201]" filled="t" stroked="t" coordsize="21600,21600" o:gfxdata="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">
+              <v:shape id="_x0000_s1026" o:spid="_x0000_s1026" o:spt="202" type="#_x0000_t202" style="position:absolute;left:0pt;margin-left:-79.95pt;margin-top:411.3pt;height:193.35pt;width:247.55pt;z-index:251661312;mso-width-relative:page;mso-height-relative:page;" fillcolor="#FFFFFF [3201]" filled="t" stroked="t" coordsize="21600,21600" o:gfxdata="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">
                 <v:fill on="t" focussize="0,0"/>
                 <v:stroke weight="0.5pt" color="#000000 [3204]" joinstyle="round"/>
                 <v:imagedata o:title=""/>
@@ -1473,7 +1473,7 @@
           </mc:Choice>
           <mc:Fallback>
             <w:pict>
-              <v:shape id="_x0000_s1026" o:spid="_x0000_s1026" o:spt="202" type="#_x0000_t202" style="position:absolute;left:0pt;margin-left:-78.8pt;margin-top:613.35pt;height:106.45pt;width:246pt;z-index:251662336;mso-width-relative:page;mso-height-relative:page;" fillcolor="#FFFFFF [3201]" filled="t" stroked="t" coordsize="21600,21600" o:gfxdata="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">
+              <v:shape id="_x0000_s1026" o:spid="_x0000_s1026" o:spt="202" type="#_x0000_t202" style="position:absolute;left:0pt;margin-left:-78.8pt;margin-top:613.35pt;height:106.45pt;width:246pt;z-index:251662336;mso-width-relative:page;mso-height-relative:page;" fillcolor="#FFFFFF [3201]" filled="t" stroked="t" coordsize="21600,21600" o:gfxdata="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">
                 <v:fill on="t" focussize="0,0"/>
                 <v:stroke weight="0.5pt" color="#000000 [3204]" joinstyle="round"/>
                 <v:imagedata o:title=""/>
@@ -2096,7 +2096,7 @@
           </mc:Choice>
           <mc:Fallback>
             <w:pict>
-              <v:shape id="_x0000_s1026" o:spid="_x0000_s1026" o:spt="202" type="#_x0000_t202" style="position:absolute;left:0pt;margin-left:-81.45pt;margin-top:157.3pt;height:243.65pt;width:247.35pt;z-index:251660288;mso-width-relative:page;mso-height-relative:page;" fillcolor="#FFFFFF [3201]" filled="t" stroked="t" coordsize="21600,21600" o:gfxdata="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">
+              <v:shape id="_x0000_s1026" o:spid="_x0000_s1026" o:spt="202" type="#_x0000_t202" style="position:absolute;left:0pt;margin-left:-81.45pt;margin-top:157.3pt;height:243.65pt;width:247.35pt;z-index:251660288;mso-width-relative:page;mso-height-relative:page;" fillcolor="#FFFFFF [3201]" filled="t" stroked="t" coordsize="21600,21600" o:gfxdata="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">
                 <v:fill on="t" focussize="0,0"/>
                 <v:stroke weight="0.5pt" color="#000000 [3204]" joinstyle="round"/>
                 <v:imagedata o:title=""/>
@@ -2583,8 +2583,6 @@
           <w:rFonts w:eastAsiaTheme="minorEastAsia"/>
         </w:rPr>
       </w:pPr>
-      <w:bookmarkStart w:id="0" w:name="_GoBack"/>
-      <w:bookmarkEnd w:id="0"/>
       <w:r>
         <w:rPr>
           <w:sz w:val="20"/>
@@ -2804,6 +2802,7 @@
                               <w:keepLines w:val="0"/>
                               <w:widowControl/>
                               <w:numPr>
+                                <w:ilvl w:val="0"/>
                                 <w:numId w:val="0"/>
                               </w:numPr>
                               <w:suppressLineNumbers w:val="0"/>
@@ -3071,6 +3070,7 @@
                         <w:keepLines w:val="0"/>
                         <w:widowControl/>
                         <w:numPr>
+                          <w:ilvl w:val="0"/>
                           <w:numId w:val="0"/>
                         </w:numPr>
                         <w:suppressLineNumbers w:val="0"/>
@@ -4239,6 +4239,7 @@
                               <w:keepLines w:val="0"/>
                               <w:widowControl/>
                               <w:numPr>
+                                <w:ilvl w:val="0"/>
                                 <w:numId w:val="0"/>
                               </w:numPr>
                               <w:suppressLineNumbers w:val="0"/>
@@ -4508,6 +4509,7 @@
                         <w:keepLines w:val="0"/>
                         <w:widowControl/>
                         <w:numPr>
+                          <w:ilvl w:val="0"/>
                           <w:numId w:val="0"/>
                         </w:numPr>
                         <w:suppressLineNumbers w:val="0"/>
@@ -4620,8 +4622,8 @@
                 <wp:positionV relativeFrom="paragraph">
                   <wp:posOffset>-694055</wp:posOffset>
                 </wp:positionV>
-                <wp:extent cx="3446780" cy="3161665"/>
-                <wp:effectExtent l="4445" t="4445" r="15875" b="15240"/>
+                <wp:extent cx="3446780" cy="3628390"/>
+                <wp:effectExtent l="4445" t="4445" r="15875" b="5715"/>
                 <wp:wrapNone/>
                 <wp:docPr id="19" name="Text Box 19"/>
                 <wp:cNvGraphicFramePr/>
@@ -4632,7 +4634,7 @@
                       <wps:spPr>
                         <a:xfrm>
                           <a:off x="4909185" y="1029970"/>
-                          <a:ext cx="3446780" cy="3161665"/>
+                          <a:ext cx="3446780" cy="3628390"/>
                         </a:xfrm>
                         <a:prstGeom prst="rect">
                           <a:avLst/>
@@ -4939,7 +4941,7 @@
           </mc:Choice>
           <mc:Fallback>
             <w:pict>
-              <v:shape id="_x0000_s1026" o:spid="_x0000_s1026" o:spt="202" type="#_x0000_t202" style="position:absolute;left:0pt;margin-left:201.35pt;margin-top:-54.65pt;height:248.95pt;width:271.4pt;z-index:251669504;mso-width-relative:page;mso-height-relative:page;" fillcolor="#FFFFFF [3201]" filled="t" stroked="t" coordsize="21600,21600" o:gfxdata="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">
+              <v:shape id="_x0000_s1026" o:spid="_x0000_s1026" o:spt="202" type="#_x0000_t202" style="position:absolute;left:0pt;margin-left:201.35pt;margin-top:-54.65pt;height:285.7pt;width:271.4pt;z-index:251669504;mso-width-relative:page;mso-height-relative:page;" fillcolor="#FFFFFF [3201]" filled="t" stroked="t" coordsize="21600,21600" o:gfxdata="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">
                 <v:fill on="t" focussize="0,0"/>
                 <v:stroke weight="0.5pt" color="#000000 [3204]" joinstyle="round"/>
                 <v:imagedata o:title=""/>
@@ -5217,6 +5219,8 @@
           </mc:Fallback>
         </mc:AlternateContent>
       </w:r>
+      <w:bookmarkStart w:id="0" w:name="_GoBack"/>
+      <w:bookmarkEnd w:id="0"/>
       <w:r>
         <w:rPr>
           <w:sz w:val="20"/>
@@ -5232,8 +5236,8 @@
                 <wp:positionV relativeFrom="paragraph">
                   <wp:posOffset>-662305</wp:posOffset>
                 </wp:positionV>
-                <wp:extent cx="3371850" cy="3153410"/>
-                <wp:effectExtent l="4445" t="4445" r="14605" b="23495"/>
+                <wp:extent cx="3371850" cy="3600450"/>
+                <wp:effectExtent l="4445" t="4445" r="14605" b="14605"/>
                 <wp:wrapNone/>
                 <wp:docPr id="17" name="Text Box 17"/>
                 <wp:cNvGraphicFramePr/>
@@ -5244,7 +5248,7 @@
                       <wps:spPr>
                         <a:xfrm>
                           <a:off x="241935" y="252095"/>
-                          <a:ext cx="3371850" cy="3153410"/>
+                          <a:ext cx="3371850" cy="3600450"/>
                         </a:xfrm>
                         <a:prstGeom prst="rect">
                           <a:avLst/>
@@ -5309,6 +5313,14 @@
                               <w:jc w:val="left"/>
                               <w:rPr>
                                 <w:rFonts w:hint="default" w:asciiTheme="minorAscii" w:hAnsiTheme="minorAscii"/>
+                                <w:b/>
+                                <w:bCs/>
+                                <w:i w:val="0"/>
+                                <w:iCs w:val="0"/>
+                                <w:color w:val="000000"/>
+                                <w:spacing w:val="0"/>
+                                <w:sz w:val="24"/>
+                                <w:szCs w:val="24"/>
                               </w:rPr>
                             </w:pPr>
                             <w:r>
@@ -5372,7 +5384,50 @@
                               <w:keepNext w:val="0"/>
                               <w:keepLines w:val="0"/>
                               <w:widowControl/>
+                              <w:suppressLineNumbers w:val="0"/>
+                              <w:spacing w:line="21" w:lineRule="atLeast"/>
+                              <w:ind w:left="0"/>
+                              <w:jc w:val="left"/>
+                              <w:rPr>
+                                <w:rFonts w:hint="default" w:asciiTheme="minorAscii" w:hAnsiTheme="minorAscii"/>
+                                <w:b/>
+                                <w:bCs/>
+                                <w:i w:val="0"/>
+                                <w:iCs w:val="0"/>
+                                <w:color w:val="000000"/>
+                                <w:spacing w:val="0"/>
+                                <w:sz w:val="24"/>
+                                <w:szCs w:val="24"/>
+                              </w:rPr>
+                            </w:pPr>
+                            <w:r>
+                              <w:rPr>
+                                <w:rFonts w:ascii="Times New Roman" w:hAnsi="Times New Roman" w:cs="Times New Roman"/>
+                              </w:rPr>
+                              <w:t xml:space="preserve">CGPA: </w:t>
+                            </w:r>
+                            <w:r>
+                              <w:rPr>
+                                <w:rFonts w:hint="default" w:cs="Times New Roman"/>
+                                <w:lang w:val="en-US"/>
+                              </w:rPr>
+                              <w:t>3.18</w:t>
+                            </w:r>
+                            <w:r>
+                              <w:rPr>
+                                <w:rFonts w:ascii="Times New Roman" w:hAnsi="Times New Roman" w:cs="Times New Roman"/>
+                              </w:rPr>
+                              <w:t>/4.00</w:t>
+                            </w:r>
+                          </w:p>
+                          <w:p>
+                            <w:pPr>
+                              <w:pStyle w:val="10"/>
+                              <w:keepNext w:val="0"/>
+                              <w:keepLines w:val="0"/>
+                              <w:widowControl/>
                               <w:numPr>
+                                <w:ilvl w:val="0"/>
                                 <w:numId w:val="0"/>
                               </w:numPr>
                               <w:suppressLineNumbers w:val="0"/>
@@ -5727,7 +5782,7 @@
           </mc:Choice>
           <mc:Fallback>
             <w:pict>
-              <v:shape id="_x0000_s1026" o:spid="_x0000_s1026" o:spt="202" type="#_x0000_t202" style="position:absolute;left:0pt;margin-left:-70.95pt;margin-top:-52.15pt;height:248.3pt;width:265.5pt;z-index:251668480;mso-width-relative:page;mso-height-relative:page;" fillcolor="#FFFFFF [3201]" filled="t" stroked="t" coordsize="21600,21600" o:gfxdata="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">
+              <v:shape id="_x0000_s1026" o:spid="_x0000_s1026" o:spt="202" type="#_x0000_t202" style="position:absolute;left:0pt;margin-left:-70.95pt;margin-top:-52.15pt;height:283.5pt;width:265.5pt;z-index:251668480;mso-width-relative:page;mso-height-relative:page;" fillcolor="#FFFFFF [3201]" filled="t" stroked="t" coordsize="21600,21600" o:gfxdata="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">
                 <v:fill on="t" focussize="0,0"/>
                 <v:stroke weight="0.5pt" color="#000000 [3204]" joinstyle="round"/>
                 <v:imagedata o:title=""/>
@@ -5769,6 +5824,14 @@
                         <w:jc w:val="left"/>
                         <w:rPr>
                           <w:rFonts w:hint="default" w:asciiTheme="minorAscii" w:hAnsiTheme="minorAscii"/>
+                          <w:b/>
+                          <w:bCs/>
+                          <w:i w:val="0"/>
+                          <w:iCs w:val="0"/>
+                          <w:color w:val="000000"/>
+                          <w:spacing w:val="0"/>
+                          <w:sz w:val="24"/>
+                          <w:szCs w:val="24"/>
                         </w:rPr>
                       </w:pPr>
                       <w:r>
@@ -5832,7 +5895,50 @@
                         <w:keepNext w:val="0"/>
                         <w:keepLines w:val="0"/>
                         <w:widowControl/>
+                        <w:suppressLineNumbers w:val="0"/>
+                        <w:spacing w:line="21" w:lineRule="atLeast"/>
+                        <w:ind w:left="0"/>
+                        <w:jc w:val="left"/>
+                        <w:rPr>
+                          <w:rFonts w:hint="default" w:asciiTheme="minorAscii" w:hAnsiTheme="minorAscii"/>
+                          <w:b/>
+                          <w:bCs/>
+                          <w:i w:val="0"/>
+                          <w:iCs w:val="0"/>
+                          <w:color w:val="000000"/>
+                          <w:spacing w:val="0"/>
+                          <w:sz w:val="24"/>
+                          <w:szCs w:val="24"/>
+                        </w:rPr>
+                      </w:pPr>
+                      <w:r>
+                        <w:rPr>
+                          <w:rFonts w:ascii="Times New Roman" w:hAnsi="Times New Roman" w:cs="Times New Roman"/>
+                        </w:rPr>
+                        <w:t xml:space="preserve">CGPA: </w:t>
+                      </w:r>
+                      <w:r>
+                        <w:rPr>
+                          <w:rFonts w:hint="default" w:cs="Times New Roman"/>
+                          <w:lang w:val="en-US"/>
+                        </w:rPr>
+                        <w:t>3.18</w:t>
+                      </w:r>
+                      <w:r>
+                        <w:rPr>
+                          <w:rFonts w:ascii="Times New Roman" w:hAnsi="Times New Roman" w:cs="Times New Roman"/>
+                        </w:rPr>
+                        <w:t>/4.00</w:t>
+                      </w:r>
+                    </w:p>
+                    <w:p>
+                      <w:pPr>
+                        <w:pStyle w:val="10"/>
+                        <w:keepNext w:val="0"/>
+                        <w:keepLines w:val="0"/>
+                        <w:widowControl/>
                         <w:numPr>
+                          <w:ilvl w:val="0"/>
                           <w:numId w:val="0"/>
                         </w:numPr>
                         <w:suppressLineNumbers w:val="0"/>
@@ -7195,8 +7301,8 @@
     <w:lsdException w:unhideWhenUsed="0" w:uiPriority="0" w:semiHidden="0" w:name="Normal Indent"/>
     <w:lsdException w:unhideWhenUsed="0" w:uiPriority="0" w:semiHidden="0" w:name="footnote text"/>
     <w:lsdException w:unhideWhenUsed="0" w:uiPriority="0" w:semiHidden="0" w:name="annotation text"/>
-    <w:lsdException w:unhideWhenUsed="0" w:uiPriority="0" w:semiHidden="0" w:name="header"/>
-    <w:lsdException w:unhideWhenUsed="0" w:uiPriority="0" w:semiHidden="0" w:name="footer"/>
+    <w:lsdException w:qFormat="1" w:unhideWhenUsed="0" w:uiPriority="0" w:semiHidden="0" w:name="header"/>
+    <w:lsdException w:qFormat="1" w:unhideWhenUsed="0" w:uiPriority="0" w:semiHidden="0" w:name="footer"/>
     <w:lsdException w:unhideWhenUsed="0" w:uiPriority="0" w:semiHidden="0" w:name="index heading"/>
     <w:lsdException w:qFormat="1" w:uiPriority="0" w:name="caption"/>
     <w:lsdException w:unhideWhenUsed="0" w:uiPriority="0" w:semiHidden="0" w:name="table of figures"/>
@@ -7249,14 +7355,14 @@
     <w:lsdException w:unhideWhenUsed="0" w:uiPriority="0" w:semiHidden="0" w:name="Body Text Indent 2"/>
     <w:lsdException w:unhideWhenUsed="0" w:uiPriority="0" w:semiHidden="0" w:name="Body Text Indent 3"/>
     <w:lsdException w:unhideWhenUsed="0" w:uiPriority="0" w:semiHidden="0" w:name="Block Text"/>
-    <w:lsdException w:unhideWhenUsed="0" w:uiPriority="0" w:semiHidden="0" w:name="Hyperlink"/>
+    <w:lsdException w:qFormat="1" w:unhideWhenUsed="0" w:uiPriority="0" w:semiHidden="0" w:name="Hyperlink"/>
     <w:lsdException w:unhideWhenUsed="0" w:uiPriority="0" w:semiHidden="0" w:name="FollowedHyperlink"/>
     <w:lsdException w:qFormat="1" w:unhideWhenUsed="0" w:uiPriority="0" w:semiHidden="0" w:name="Strong"/>
     <w:lsdException w:qFormat="1" w:unhideWhenUsed="0" w:uiPriority="0" w:semiHidden="0" w:name="Emphasis"/>
     <w:lsdException w:unhideWhenUsed="0" w:uiPriority="0" w:semiHidden="0" w:name="Document Map"/>
     <w:lsdException w:unhideWhenUsed="0" w:uiPriority="0" w:semiHidden="0" w:name="Plain Text"/>
     <w:lsdException w:unhideWhenUsed="0" w:uiPriority="0" w:semiHidden="0" w:name="E-mail Signature"/>
-    <w:lsdException w:unhideWhenUsed="0" w:uiPriority="0" w:semiHidden="0" w:name="Normal (Web)"/>
+    <w:lsdException w:qFormat="1" w:unhideWhenUsed="0" w:uiPriority="0" w:semiHidden="0" w:name="Normal (Web)"/>
     <w:lsdException w:unhideWhenUsed="0" w:uiPriority="0" w:semiHidden="0" w:name="HTML Acronym"/>
     <w:lsdException w:unhideWhenUsed="0" w:uiPriority="0" w:semiHidden="0" w:name="HTML Address"/>
     <w:lsdException w:unhideWhenUsed="0" w:uiPriority="0" w:semiHidden="0" w:name="HTML Cite"/>
@@ -7497,6 +7603,7 @@
   <w:style w:type="paragraph" w:styleId="7">
     <w:name w:val="footer"/>
     <w:basedOn w:val="1"/>
+    <w:qFormat/>
     <w:uiPriority w:val="0"/>
     <w:pPr>
       <w:widowControl w:val="0"/>
@@ -7516,6 +7623,7 @@
   <w:style w:type="paragraph" w:styleId="8">
     <w:name w:val="header"/>
     <w:basedOn w:val="1"/>
+    <w:qFormat/>
     <w:uiPriority w:val="0"/>
     <w:pPr>
       <w:widowControl w:val="0"/>
@@ -7543,6 +7651,7 @@
   <w:style w:type="character" w:styleId="9">
     <w:name w:val="Hyperlink"/>
     <w:basedOn w:val="4"/>
+    <w:qFormat/>
     <w:uiPriority w:val="0"/>
     <w:rPr>
       <w:color w:val="0000FF"/>
@@ -7551,6 +7660,7 @@
   </w:style>
   <w:style w:type="paragraph" w:styleId="10">
     <w:name w:val="Normal (Web)"/>
+    <w:qFormat/>
     <w:uiPriority w:val="0"/>
     <w:pPr>
       <w:spacing w:before="0" w:beforeAutospacing="1" w:after="0" w:afterAutospacing="1"/>

</xml_diff>

<commit_message>
update CV files: modify Cv.docx and Cv.pdf
</commit_message>
<xml_diff>
--- a/Cv.docx
+++ b/Cv.docx
@@ -25,16 +25,16 @@
           <w:sz w:val="20"/>
         </w:rPr>
         <w:drawing>
-          <wp:anchor distT="0" distB="0" distL="114300" distR="114300" simplePos="0" relativeHeight="251659264" behindDoc="0" locked="0" layoutInCell="1" allowOverlap="1">
+          <wp:anchor distT="0" distB="0" distL="114300" distR="114300" simplePos="0" relativeHeight="251673600" behindDoc="0" locked="0" layoutInCell="1" allowOverlap="1">
             <wp:simplePos x="0" y="0"/>
             <wp:positionH relativeFrom="column">
-              <wp:posOffset>3049905</wp:posOffset>
+              <wp:posOffset>-931545</wp:posOffset>
             </wp:positionH>
             <wp:positionV relativeFrom="paragraph">
-              <wp:posOffset>-837565</wp:posOffset>
+              <wp:posOffset>-499745</wp:posOffset>
             </wp:positionV>
-            <wp:extent cx="3236595" cy="2228850"/>
-            <wp:effectExtent l="0" t="0" r="1905" b="0"/>
+            <wp:extent cx="3188970" cy="2195830"/>
+            <wp:effectExtent l="0" t="0" r="11430" b="13970"/>
             <wp:wrapNone/>
             <wp:docPr id="3" name="Picture 3" descr="DSC_8287"/>
             <wp:cNvGraphicFramePr>
@@ -58,7 +58,7 @@
                   <pic:spPr>
                     <a:xfrm>
                       <a:off x="0" y="0"/>
-                      <a:ext cx="3236595" cy="2228850"/>
+                      <a:ext cx="3188970" cy="2195830"/>
                     </a:xfrm>
                     <a:prstGeom prst="rect">
                       <a:avLst/>
@@ -77,7 +77,7 @@
         <mc:AlternateContent>
           <mc:Choice Requires="wps">
             <w:drawing>
-              <wp:anchor distT="0" distB="0" distL="114300" distR="114300" simplePos="0" relativeHeight="251666432" behindDoc="0" locked="0" layoutInCell="1" allowOverlap="1">
+              <wp:anchor distT="0" distB="0" distL="114300" distR="114300" simplePos="0" relativeHeight="251665408" behindDoc="0" locked="0" layoutInCell="1" allowOverlap="1">
                 <wp:simplePos x="0" y="0"/>
                 <wp:positionH relativeFrom="column">
                   <wp:posOffset>2834005</wp:posOffset>
@@ -182,7 +182,7 @@
           </mc:Choice>
           <mc:Fallback>
             <w:pict>
-              <v:shape id="_x0000_s1026" o:spid="_x0000_s1026" o:spt="202" type="#_x0000_t202" style="position:absolute;left:0pt;margin-left:223.15pt;margin-top:334.35pt;height:65.25pt;width:194.2pt;z-index:251666432;mso-width-relative:page;mso-height-relative:page;" fillcolor="#FFFFFF [3201]" filled="t" stroked="t" coordsize="21600,21600" o:gfxdata="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">
+              <v:shape id="_x0000_s1026" o:spid="_x0000_s1026" o:spt="202" type="#_x0000_t202" style="position:absolute;left:0pt;margin-left:223.15pt;margin-top:334.35pt;height:65.25pt;width:194.2pt;z-index:251665408;mso-width-relative:page;mso-height-relative:page;" fillcolor="#FFFFFF [3201]" filled="t" stroked="t" coordsize="21600,21600" o:gfxdata="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">
                 <v:fill on="t" focussize="0,0"/>
                 <v:stroke weight="0.5pt" color="#000000 [3204]" joinstyle="round"/>
                 <v:imagedata o:title=""/>
@@ -245,7 +245,7 @@
         <mc:AlternateContent>
           <mc:Choice Requires="wps">
             <w:drawing>
-              <wp:anchor distT="0" distB="0" distL="114300" distR="114300" simplePos="0" relativeHeight="251664384" behindDoc="0" locked="0" layoutInCell="1" allowOverlap="1">
+              <wp:anchor distT="0" distB="0" distL="114300" distR="114300" simplePos="0" relativeHeight="251663360" behindDoc="0" locked="0" layoutInCell="1" allowOverlap="1">
                 <wp:simplePos x="0" y="0"/>
                 <wp:positionH relativeFrom="column">
                   <wp:posOffset>2424430</wp:posOffset>
@@ -337,7 +337,7 @@
           </mc:Choice>
           <mc:Fallback>
             <w:pict>
-              <v:shape id="_x0000_s1026" o:spid="_x0000_s1026" o:spt="202" type="#_x0000_t202" style="position:absolute;left:0pt;margin-left:190.9pt;margin-top:422.55pt;height:258.65pt;width:296.15pt;z-index:251664384;mso-width-relative:page;mso-height-relative:page;" fillcolor="#FFFFFF [3201]" filled="t" stroked="t" coordsize="21600,21600" o:gfxdata="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">
+              <v:shape id="_x0000_s1026" o:spid="_x0000_s1026" o:spt="202" type="#_x0000_t202" style="position:absolute;left:0pt;margin-left:190.9pt;margin-top:422.55pt;height:258.65pt;width:296.15pt;z-index:251663360;mso-width-relative:page;mso-height-relative:page;" fillcolor="#FFFFFF [3201]" filled="t" stroked="t" coordsize="21600,21600" o:gfxdata="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">
                 <v:fill on="t" focussize="0,0"/>
                 <v:stroke weight="0.5pt" color="#000000 [3204]" joinstyle="round"/>
                 <v:imagedata o:title=""/>
@@ -387,7 +387,7 @@
         <mc:AlternateContent>
           <mc:Choice Requires="wps">
             <w:drawing>
-              <wp:anchor distT="0" distB="0" distL="114300" distR="114300" simplePos="0" relativeHeight="251665408" behindDoc="0" locked="0" layoutInCell="1" allowOverlap="1">
+              <wp:anchor distT="0" distB="0" distL="114300" distR="114300" simplePos="0" relativeHeight="251664384" behindDoc="0" locked="0" layoutInCell="1" allowOverlap="1">
                 <wp:simplePos x="0" y="0"/>
                 <wp:positionH relativeFrom="column">
                   <wp:posOffset>2338070</wp:posOffset>
@@ -588,7 +588,7 @@
           </mc:Choice>
           <mc:Fallback>
             <w:pict>
-              <v:shape id="_x0000_s1026" o:spid="_x0000_s1026" o:spt="202" type="#_x0000_t202" style="position:absolute;left:0pt;flip:y;margin-left:184.1pt;margin-top:695.1pt;height:7.5pt;width:6pt;z-index:251665408;mso-width-relative:page;mso-height-relative:page;" fillcolor="#FFFFFF [3201]" filled="t" stroked="t" coordsize="21600,21600" o:gfxdata="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">
+              <v:shape id="_x0000_s1026" o:spid="_x0000_s1026" o:spt="202" type="#_x0000_t202" style="position:absolute;left:0pt;flip:y;margin-left:184.1pt;margin-top:695.1pt;height:7.5pt;width:6pt;z-index:251664384;mso-width-relative:page;mso-height-relative:page;" fillcolor="#FFFFFF [3201]" filled="t" stroked="t" coordsize="21600,21600" o:gfxdata="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">
                 <v:fill on="t" focussize="0,0"/>
                 <v:stroke weight="0.5pt" color="#000000 [3204]" joinstyle="round"/>
                 <v:imagedata o:title=""/>
@@ -747,7 +747,7 @@
         <mc:AlternateContent>
           <mc:Choice Requires="wps">
             <w:drawing>
-              <wp:anchor distT="0" distB="0" distL="114300" distR="114300" simplePos="0" relativeHeight="251661312" behindDoc="0" locked="0" layoutInCell="1" allowOverlap="1">
+              <wp:anchor distT="0" distB="0" distL="114300" distR="114300" simplePos="0" relativeHeight="251660288" behindDoc="0" locked="0" layoutInCell="1" allowOverlap="1">
                 <wp:simplePos x="0" y="0"/>
                 <wp:positionH relativeFrom="column">
                   <wp:posOffset>-1015365</wp:posOffset>
@@ -1040,7 +1040,7 @@
           </mc:Choice>
           <mc:Fallback>
             <w:pict>
-              <v:shape id="_x0000_s1026" o:spid="_x0000_s1026" o:spt="202" type="#_x0000_t202" style="position:absolute;left:0pt;margin-left:-79.95pt;margin-top:411.3pt;height:193.35pt;width:247.55pt;z-index:251661312;mso-width-relative:page;mso-height-relative:page;" fillcolor="#FFFFFF [3201]" filled="t" stroked="t" coordsize="21600,21600" o:gfxdata="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">
+              <v:shape id="_x0000_s1026" o:spid="_x0000_s1026" o:spt="202" type="#_x0000_t202" style="position:absolute;left:0pt;margin-left:-79.95pt;margin-top:411.3pt;height:193.35pt;width:247.55pt;z-index:251660288;mso-width-relative:page;mso-height-relative:page;" fillcolor="#FFFFFF [3201]" filled="t" stroked="t" coordsize="21600,21600" o:gfxdata="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">
                 <v:fill on="t" focussize="0,0"/>
                 <v:stroke weight="0.5pt" color="#000000 [3204]" joinstyle="round"/>
                 <v:imagedata o:title=""/>
@@ -1291,7 +1291,7 @@
         <mc:AlternateContent>
           <mc:Choice Requires="wps">
             <w:drawing>
-              <wp:anchor distT="0" distB="0" distL="114300" distR="114300" simplePos="0" relativeHeight="251662336" behindDoc="0" locked="0" layoutInCell="1" allowOverlap="1">
+              <wp:anchor distT="0" distB="0" distL="114300" distR="114300" simplePos="0" relativeHeight="251661312" behindDoc="0" locked="0" layoutInCell="1" allowOverlap="1">
                 <wp:simplePos x="0" y="0"/>
                 <wp:positionH relativeFrom="column">
                   <wp:posOffset>-1000760</wp:posOffset>
@@ -1473,7 +1473,7 @@
           </mc:Choice>
           <mc:Fallback>
             <w:pict>
-              <v:shape id="_x0000_s1026" o:spid="_x0000_s1026" o:spt="202" type="#_x0000_t202" style="position:absolute;left:0pt;margin-left:-78.8pt;margin-top:613.35pt;height:106.45pt;width:246pt;z-index:251662336;mso-width-relative:page;mso-height-relative:page;" fillcolor="#FFFFFF [3201]" filled="t" stroked="t" coordsize="21600,21600" o:gfxdata="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">
+              <v:shape id="_x0000_s1026" o:spid="_x0000_s1026" o:spt="202" type="#_x0000_t202" style="position:absolute;left:0pt;margin-left:-78.8pt;margin-top:613.35pt;height:106.45pt;width:246pt;z-index:251661312;mso-width-relative:page;mso-height-relative:page;" fillcolor="#FFFFFF [3201]" filled="t" stroked="t" coordsize="21600,21600" o:gfxdata="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">
                 <v:fill on="t" focussize="0,0"/>
                 <v:stroke weight="0.5pt" color="#000000 [3204]" joinstyle="round"/>
                 <v:imagedata o:title=""/>
@@ -1613,7 +1613,7 @@
         <mc:AlternateContent>
           <mc:Choice Requires="wps">
             <w:drawing>
-              <wp:anchor distT="0" distB="0" distL="114300" distR="114300" simplePos="0" relativeHeight="251660288" behindDoc="0" locked="0" layoutInCell="1" allowOverlap="1">
+              <wp:anchor distT="0" distB="0" distL="114300" distR="114300" simplePos="0" relativeHeight="251659264" behindDoc="0" locked="0" layoutInCell="1" allowOverlap="1">
                 <wp:simplePos x="0" y="0"/>
                 <wp:positionH relativeFrom="column">
                   <wp:posOffset>-1034415</wp:posOffset>
@@ -2096,7 +2096,7 @@
           </mc:Choice>
           <mc:Fallback>
             <w:pict>
-              <v:shape id="_x0000_s1026" o:spid="_x0000_s1026" o:spt="202" type="#_x0000_t202" style="position:absolute;left:0pt;margin-left:-81.45pt;margin-top:157.3pt;height:243.65pt;width:247.35pt;z-index:251660288;mso-width-relative:page;mso-height-relative:page;" fillcolor="#FFFFFF [3201]" filled="t" stroked="t" coordsize="21600,21600" o:gfxdata="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">
+              <v:shape id="_x0000_s1026" o:spid="_x0000_s1026" o:spt="202" type="#_x0000_t202" style="position:absolute;left:0pt;margin-left:-81.45pt;margin-top:157.3pt;height:243.65pt;width:247.35pt;z-index:251659264;mso-width-relative:page;mso-height-relative:page;" fillcolor="#FFFFFF [3201]" filled="t" stroked="t" coordsize="21600,21600" o:gfxdata="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">
                 <v:fill on="t" focussize="0,0"/>
                 <v:stroke weight="0.5pt" color="#000000 [3204]" joinstyle="round"/>
                 <v:imagedata o:title=""/>
@@ -2532,7 +2532,7 @@
       </w:r>
       <w:r>
         <w:pict>
-          <v:shape id="_x0000_s1030" o:spid="_x0000_s1030" o:spt="202" type="#_x0000_t202" style="position:absolute;left:0pt;margin-left:118.45pt;margin-top:438.05pt;height:6pt;width:6pt;z-index:251663360;mso-width-relative:page;mso-height-relative:page;" filled="f" stroked="f" coordsize="21600,21600">
+          <v:shape id="_x0000_s1030" o:spid="_x0000_s1030" o:spt="202" type="#_x0000_t202" style="position:absolute;left:0pt;margin-left:118.45pt;margin-top:438.05pt;height:6pt;width:6pt;z-index:251662336;mso-width-relative:page;mso-height-relative:page;" filled="f" stroked="f" coordsize="21600,21600">
             <v:path/>
             <v:fill on="f" focussize="0,0"/>
             <v:stroke on="f"/>
@@ -2583,6 +2583,8 @@
           <w:rFonts w:eastAsiaTheme="minorEastAsia"/>
         </w:rPr>
       </w:pPr>
+      <w:bookmarkStart w:id="0" w:name="_GoBack"/>
+      <w:bookmarkEnd w:id="0"/>
       <w:r>
         <w:rPr>
           <w:sz w:val="20"/>
@@ -2590,7 +2592,7 @@
         <mc:AlternateContent>
           <mc:Choice Requires="wps">
             <w:drawing>
-              <wp:anchor distT="0" distB="0" distL="114300" distR="114300" simplePos="0" relativeHeight="251673600" behindDoc="0" locked="0" layoutInCell="1" allowOverlap="1">
+              <wp:anchor distT="0" distB="0" distL="114300" distR="114300" simplePos="0" relativeHeight="251672576" behindDoc="0" locked="0" layoutInCell="1" allowOverlap="1">
                 <wp:simplePos x="0" y="0"/>
                 <wp:positionH relativeFrom="column">
                   <wp:posOffset>2633345</wp:posOffset>
@@ -2901,7 +2903,7 @@
           </mc:Choice>
           <mc:Fallback>
             <w:pict>
-              <v:shape id="_x0000_s1026" o:spid="_x0000_s1026" o:spt="202" type="#_x0000_t202" style="position:absolute;left:0pt;margin-left:207.35pt;margin-top:234.6pt;height:240.75pt;width:265.45pt;z-index:251673600;mso-width-relative:page;mso-height-relative:page;" fillcolor="#FFFFFF [3201]" filled="t" stroked="t" coordsize="21600,21600" o:gfxdata="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">
+              <v:shape id="_x0000_s1026" o:spid="_x0000_s1026" o:spt="202" type="#_x0000_t202" style="position:absolute;left:0pt;margin-left:207.35pt;margin-top:234.6pt;height:240.75pt;width:265.45pt;z-index:251672576;mso-width-relative:page;mso-height-relative:page;" fillcolor="#FFFFFF [3201]" filled="t" stroked="t" coordsize="21600,21600" o:gfxdata="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">
                 <v:fill on="t" focussize="0,0"/>
                 <v:stroke weight="0.5pt" color="#000000 [3204]" joinstyle="round"/>
                 <v:imagedata o:title=""/>
@@ -3170,7 +3172,7 @@
         <mc:AlternateContent>
           <mc:Choice Requires="wps">
             <w:drawing>
-              <wp:anchor distT="0" distB="0" distL="114300" distR="114300" simplePos="0" relativeHeight="251672576" behindDoc="0" locked="0" layoutInCell="1" allowOverlap="1">
+              <wp:anchor distT="0" distB="0" distL="114300" distR="114300" simplePos="0" relativeHeight="251671552" behindDoc="0" locked="0" layoutInCell="1" allowOverlap="1">
                 <wp:simplePos x="0" y="0"/>
                 <wp:positionH relativeFrom="column">
                   <wp:posOffset>-1034415</wp:posOffset>
@@ -3330,7 +3332,7 @@
           </mc:Choice>
           <mc:Fallback>
             <w:pict>
-              <v:shape id="_x0000_s1026" o:spid="_x0000_s1026" o:spt="202" type="#_x0000_t202" style="position:absolute;left:0pt;margin-left:-81.45pt;margin-top:488.55pt;height:90.8pt;width:279.7pt;z-index:251672576;mso-width-relative:page;mso-height-relative:page;" fillcolor="#FFFFFF [3201]" filled="t" stroked="t" coordsize="21600,21600" o:gfxdata="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">
+              <v:shape id="_x0000_s1026" o:spid="_x0000_s1026" o:spt="202" type="#_x0000_t202" style="position:absolute;left:0pt;margin-left:-81.45pt;margin-top:488.55pt;height:90.8pt;width:279.7pt;z-index:251671552;mso-width-relative:page;mso-height-relative:page;" fillcolor="#FFFFFF [3201]" filled="t" stroked="t" coordsize="21600,21600" o:gfxdata="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">
                 <v:fill on="t" focussize="0,0"/>
                 <v:stroke weight="0.5pt" color="#000000 [3204]" joinstyle="round"/>
                 <v:imagedata o:title=""/>
@@ -3448,7 +3450,7 @@
         <mc:AlternateContent>
           <mc:Choice Requires="wps">
             <w:drawing>
-              <wp:anchor distT="0" distB="0" distL="114300" distR="114300" simplePos="0" relativeHeight="251671552" behindDoc="0" locked="0" layoutInCell="1" allowOverlap="1">
+              <wp:anchor distT="0" distB="0" distL="114300" distR="114300" simplePos="0" relativeHeight="251670528" behindDoc="0" locked="0" layoutInCell="1" allowOverlap="1">
                 <wp:simplePos x="0" y="0"/>
                 <wp:positionH relativeFrom="column">
                   <wp:posOffset>832485</wp:posOffset>
@@ -3760,7 +3762,7 @@
           </mc:Choice>
           <mc:Fallback>
             <w:pict>
-              <v:shape id="_x0000_s1026" o:spid="_x0000_s1026" o:spt="202" type="#_x0000_t202" style="position:absolute;left:0pt;margin-left:65.55pt;margin-top:234.65pt;height:241.4pt;width:129pt;z-index:251671552;mso-width-relative:page;mso-height-relative:page;" fillcolor="#FFFFFF [3201]" filled="t" stroked="t" coordsize="21600,21600" o:gfxdata="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">
+              <v:shape id="_x0000_s1026" o:spid="_x0000_s1026" o:spt="202" type="#_x0000_t202" style="position:absolute;left:0pt;margin-left:65.55pt;margin-top:234.65pt;height:241.4pt;width:129pt;z-index:251670528;mso-width-relative:page;mso-height-relative:page;" fillcolor="#FFFFFF [3201]" filled="t" stroked="t" coordsize="21600,21600" o:gfxdata="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">
                 <v:fill on="t" focussize="0,0"/>
                 <v:stroke weight="0.5pt" color="#000000 [3204]" joinstyle="round"/>
                 <v:imagedata o:title=""/>
@@ -4030,7 +4032,7 @@
         <mc:AlternateContent>
           <mc:Choice Requires="wps">
             <w:drawing>
-              <wp:anchor distT="0" distB="0" distL="114300" distR="114300" simplePos="0" relativeHeight="251670528" behindDoc="0" locked="0" layoutInCell="1" allowOverlap="1">
+              <wp:anchor distT="0" distB="0" distL="114300" distR="114300" simplePos="0" relativeHeight="251669504" behindDoc="0" locked="0" layoutInCell="1" allowOverlap="1">
                 <wp:simplePos x="0" y="0"/>
                 <wp:positionH relativeFrom="column">
                   <wp:posOffset>-975360</wp:posOffset>
@@ -4343,7 +4345,7 @@
           </mc:Choice>
           <mc:Fallback>
             <w:pict>
-              <v:shape id="_x0000_s1026" o:spid="_x0000_s1026" o:spt="202" type="#_x0000_t202" style="position:absolute;left:0pt;margin-left:-76.8pt;margin-top:236.35pt;height:241pt;width:142.35pt;z-index:251670528;mso-width-relative:page;mso-height-relative:page;" fillcolor="#FFFFFF [3201]" filled="t" stroked="t" coordsize="21600,21600" o:gfxdata="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">
+              <v:shape id="_x0000_s1026" o:spid="_x0000_s1026" o:spt="202" type="#_x0000_t202" style="position:absolute;left:0pt;margin-left:-76.8pt;margin-top:236.35pt;height:241pt;width:142.35pt;z-index:251669504;mso-width-relative:page;mso-height-relative:page;" fillcolor="#FFFFFF [3201]" filled="t" stroked="t" coordsize="21600,21600" o:gfxdata="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">
                 <v:fill on="t" focussize="0,0"/>
                 <v:stroke weight="0.5pt" color="#000000 [3204]" joinstyle="round"/>
                 <v:imagedata o:title=""/>
@@ -4614,7 +4616,7 @@
         <mc:AlternateContent>
           <mc:Choice Requires="wps">
             <w:drawing>
-              <wp:anchor distT="0" distB="0" distL="114300" distR="114300" simplePos="0" relativeHeight="251669504" behindDoc="0" locked="0" layoutInCell="1" allowOverlap="1">
+              <wp:anchor distT="0" distB="0" distL="114300" distR="114300" simplePos="0" relativeHeight="251668480" behindDoc="0" locked="0" layoutInCell="1" allowOverlap="1">
                 <wp:simplePos x="0" y="0"/>
                 <wp:positionH relativeFrom="column">
                   <wp:posOffset>2557145</wp:posOffset>
@@ -4941,7 +4943,7 @@
           </mc:Choice>
           <mc:Fallback>
             <w:pict>
-              <v:shape id="_x0000_s1026" o:spid="_x0000_s1026" o:spt="202" type="#_x0000_t202" style="position:absolute;left:0pt;margin-left:201.35pt;margin-top:-54.65pt;height:285.7pt;width:271.4pt;z-index:251669504;mso-width-relative:page;mso-height-relative:page;" fillcolor="#FFFFFF [3201]" filled="t" stroked="t" coordsize="21600,21600" o:gfxdata="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">
+              <v:shape id="_x0000_s1026" o:spid="_x0000_s1026" o:spt="202" type="#_x0000_t202" style="position:absolute;left:0pt;margin-left:201.35pt;margin-top:-54.65pt;height:285.7pt;width:271.4pt;z-index:251668480;mso-width-relative:page;mso-height-relative:page;" fillcolor="#FFFFFF [3201]" filled="t" stroked="t" coordsize="21600,21600" o:gfxdata="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">
                 <v:fill on="t" focussize="0,0"/>
                 <v:stroke weight="0.5pt" color="#000000 [3204]" joinstyle="round"/>
                 <v:imagedata o:title=""/>
@@ -5219,8 +5221,6 @@
           </mc:Fallback>
         </mc:AlternateContent>
       </w:r>
-      <w:bookmarkStart w:id="0" w:name="_GoBack"/>
-      <w:bookmarkEnd w:id="0"/>
       <w:r>
         <w:rPr>
           <w:sz w:val="20"/>
@@ -5228,7 +5228,7 @@
         <mc:AlternateContent>
           <mc:Choice Requires="wps">
             <w:drawing>
-              <wp:anchor distT="0" distB="0" distL="114300" distR="114300" simplePos="0" relativeHeight="251668480" behindDoc="0" locked="0" layoutInCell="1" allowOverlap="1">
+              <wp:anchor distT="0" distB="0" distL="114300" distR="114300" simplePos="0" relativeHeight="251667456" behindDoc="0" locked="0" layoutInCell="1" allowOverlap="1">
                 <wp:simplePos x="0" y="0"/>
                 <wp:positionH relativeFrom="column">
                   <wp:posOffset>-901065</wp:posOffset>
@@ -5782,7 +5782,7 @@
           </mc:Choice>
           <mc:Fallback>
             <w:pict>
-              <v:shape id="_x0000_s1026" o:spid="_x0000_s1026" o:spt="202" type="#_x0000_t202" style="position:absolute;left:0pt;margin-left:-70.95pt;margin-top:-52.15pt;height:283.5pt;width:265.5pt;z-index:251668480;mso-width-relative:page;mso-height-relative:page;" fillcolor="#FFFFFF [3201]" filled="t" stroked="t" coordsize="21600,21600" o:gfxdata="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">
+              <v:shape id="_x0000_s1026" o:spid="_x0000_s1026" o:spt="202" type="#_x0000_t202" style="position:absolute;left:0pt;margin-left:-70.95pt;margin-top:-52.15pt;height:283.5pt;width:265.5pt;z-index:251667456;mso-width-relative:page;mso-height-relative:page;" fillcolor="#FFFFFF [3201]" filled="t" stroked="t" coordsize="21600,21600" o:gfxdata="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">
                 <v:fill on="t" focussize="0,0"/>
                 <v:stroke weight="0.5pt" color="#000000 [3204]" joinstyle="round"/>
                 <v:imagedata o:title=""/>
@@ -6294,13 +6294,13 @@
         <mc:AlternateContent>
           <mc:Choice Requires="wps">
             <w:drawing>
-              <wp:anchor distT="0" distB="0" distL="114300" distR="114300" simplePos="0" relativeHeight="251667456" behindDoc="0" locked="0" layoutInCell="1" allowOverlap="1">
+              <wp:anchor distT="0" distB="0" distL="114300" distR="114300" simplePos="0" relativeHeight="251666432" behindDoc="0" locked="0" layoutInCell="1" allowOverlap="1">
                 <wp:simplePos x="0" y="0"/>
                 <wp:positionH relativeFrom="column">
-                  <wp:posOffset>-1177290</wp:posOffset>
+                  <wp:posOffset>80010</wp:posOffset>
                 </wp:positionH>
                 <wp:positionV relativeFrom="paragraph">
-                  <wp:posOffset>-927100</wp:posOffset>
+                  <wp:posOffset>-1117600</wp:posOffset>
                 </wp:positionV>
                 <wp:extent cx="7581265" cy="10732135"/>
                 <wp:effectExtent l="6350" t="6350" r="13335" b="24765"/>
@@ -6352,7 +6352,7 @@
           </mc:Choice>
           <mc:Fallback>
             <w:pict>
-              <v:rect id="_x0000_s1026" o:spid="_x0000_s1026" o:spt="1" style="position:absolute;left:0pt;margin-left:-92.7pt;margin-top:-73pt;height:845.05pt;width:596.95pt;z-index:251667456;v-text-anchor:middle;mso-width-relative:page;mso-height-relative:page;" fillcolor="#3B3838 [814]" filled="t" stroked="t" coordsize="21600,21600" o:gfxdata="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">
+              <v:rect id="_x0000_s1026" o:spid="_x0000_s1026" o:spt="1" style="position:absolute;left:0pt;margin-left:6.3pt;margin-top:-88pt;height:845.05pt;width:596.95pt;z-index:251666432;v-text-anchor:middle;mso-width-relative:page;mso-height-relative:page;" fillcolor="#3B3838 [814]" filled="t" stroked="t" coordsize="21600,21600" o:gfxdata="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">
                 <v:fill on="t" focussize="0,0"/>
                 <v:stroke weight="1pt" color="#41719C [3204]" miterlimit="8" joinstyle="miter"/>
                 <v:imagedata o:title=""/>

</xml_diff>